<commit_message>
Atualizar exercícios do curso
</commit_message>
<xml_diff>
--- a/Curso em Vídeo.docx
+++ b/Curso em Vídeo.docx
@@ -526,7 +526,13 @@
     </w:p>
     <w:p>
       <w:r>
-        <w:t xml:space="preserve">Exercício 020: </w:t>
+        <w:rPr>
+          <w:highlight w:val="cyan"/>
+        </w:rPr>
+        <w:t>Exercício 020:</w:t>
+      </w:r>
+      <w:r>
+        <w:t xml:space="preserve"> </w:t>
       </w:r>
       <w:r>
         <w:rPr>
@@ -542,7 +548,13 @@
     </w:p>
     <w:p>
       <w:r>
-        <w:t>Exercício 021: Faça um programa em que abra e reproduza o áudio de um arquivo MP3.</w:t>
+        <w:t xml:space="preserve">Exercício 021: </w:t>
+      </w:r>
+      <w:r>
+        <w:rPr>
+          <w:highlight w:val="cyan"/>
+        </w:rPr>
+        <w:t>Faça um programa em que abra e reproduza o áudio de um arquivo MP3.</w:t>
       </w:r>
     </w:p>
     <w:p>
@@ -557,6 +569,9 @@
     </w:p>
     <w:p>
       <w:r>
+        <w:rPr>
+          <w:highlight w:val="cyan"/>
+        </w:rPr>
         <w:t>Exercício 022: Crie um programa que leia o nome completo de uma pessoa e mostre:</w:t>
       </w:r>
     </w:p>
@@ -567,16 +582,31 @@
     </w:p>
     <w:p>
       <w:r>
-        <w:t>Exercício 023: Faça um programa que leia um número de 0 a 9999 e mostre na tela cada um dos dígitos separados.</w:t>
-      </w:r>
-    </w:p>
-    <w:p>
-      <w:r>
-        <w:t xml:space="preserve"> </w:t>
-      </w:r>
-    </w:p>
-    <w:p>
-      <w:r>
+        <w:rPr>
+          <w:highlight w:val="cyan"/>
+        </w:rPr>
+        <w:t>Exercício 023:</w:t>
+      </w:r>
+      <w:r>
+        <w:t xml:space="preserve"> </w:t>
+      </w:r>
+      <w:r>
+        <w:rPr>
+          <w:highlight w:val="cyan"/>
+        </w:rPr>
+        <w:t>Faça um programa que leia um número de 0 a 9999 e mostre na tela cada um dos dígitos separados.</w:t>
+      </w:r>
+    </w:p>
+    <w:p>
+      <w:r>
+        <w:t xml:space="preserve"> </w:t>
+      </w:r>
+    </w:p>
+    <w:p>
+      <w:r>
+        <w:rPr>
+          <w:highlight w:val="cyan"/>
+        </w:rPr>
         <w:t>Exercício 024: Crie um programa que leia o nome de uma cidade diga se ela começa ou não com o nome "SANTO".</w:t>
       </w:r>
     </w:p>
@@ -587,6 +617,9 @@
     </w:p>
     <w:p>
       <w:r>
+        <w:rPr>
+          <w:highlight w:val="cyan"/>
+        </w:rPr>
         <w:t>Exercício 025: Crie um programa que leia o nome de uma pessoa e diga se ela tem "SILVA" no nome.</w:t>
       </w:r>
     </w:p>

</xml_diff>

<commit_message>
Atualizar exercícios e arquivos
</commit_message>
<xml_diff>
--- a/Curso em Vídeo.docx
+++ b/Curso em Vídeo.docx
@@ -630,6 +630,9 @@
     </w:p>
     <w:p>
       <w:r>
+        <w:rPr>
+          <w:highlight w:val="cyan"/>
+        </w:rPr>
         <w:t>Exercício 026: Faça um programa que leia uma frase pelo teclado e mostre quantas vezes aparece a letra "A", em que posição ela aparece a primeira vez e em que posição ela aparece a última vez.</w:t>
       </w:r>
     </w:p>
@@ -640,6 +643,9 @@
     </w:p>
     <w:p>
       <w:r>
+        <w:rPr>
+          <w:highlight w:val="cyan"/>
+        </w:rPr>
         <w:t>Exercício 027: Faça um programa que leia o nome completo de uma pessoa, mostrando em seguida o primeiro e o último nome separadamente.</w:t>
       </w:r>
     </w:p>
@@ -654,18 +660,37 @@
       </w:r>
     </w:p>
     <w:p>
-      <w:r>
+      <w:pPr>
+        <w:rPr>
+          <w:highlight w:val="cyan"/>
+        </w:rPr>
+      </w:pPr>
+      <w:r>
+        <w:rPr>
+          <w:highlight w:val="cyan"/>
+        </w:rPr>
         <w:lastRenderedPageBreak/>
         <w:t>Exercício 028: Escreva um programa que faça o computador "pensar" em um número inteiro entre 0 e 5 e peça para o usuário tentar descobrir qual foi o número escolhido pelo computador. O programa deverá escrever na tela se o usuário venceu ou perdeu.</w:t>
       </w:r>
     </w:p>
     <w:p>
-      <w:r>
-        <w:t xml:space="preserve"> </w:t>
-      </w:r>
-    </w:p>
-    <w:p>
-      <w:r>
+      <w:pPr>
+        <w:rPr>
+          <w:highlight w:val="cyan"/>
+        </w:rPr>
+      </w:pPr>
+      <w:r>
+        <w:rPr>
+          <w:highlight w:val="cyan"/>
+        </w:rPr>
+        <w:t xml:space="preserve"> </w:t>
+      </w:r>
+    </w:p>
+    <w:p>
+      <w:r>
+        <w:rPr>
+          <w:highlight w:val="cyan"/>
+        </w:rPr>
         <w:t>Exercício 029: Escreva um programa que leia a velocidade de um carro. Se ele ultrapassar 80Km/h, mostre uma mensagem dizendo que ele foi multado. A multa vai custar R$7,00 por cada Km acima do limite.</w:t>
       </w:r>
     </w:p>
@@ -675,17 +700,36 @@
       </w:r>
     </w:p>
     <w:p>
-      <w:r>
+      <w:pPr>
+        <w:rPr>
+          <w:highlight w:val="cyan"/>
+        </w:rPr>
+      </w:pPr>
+      <w:r>
+        <w:rPr>
+          <w:highlight w:val="cyan"/>
+        </w:rPr>
         <w:t>Exercício 030: Crie um programa que leia um número inteiro e mostre na tela se ele é PAR ou ÍMPAR.</w:t>
       </w:r>
     </w:p>
     <w:p>
-      <w:r>
-        <w:t xml:space="preserve"> </w:t>
-      </w:r>
-    </w:p>
-    <w:p>
-      <w:r>
+      <w:pPr>
+        <w:rPr>
+          <w:highlight w:val="cyan"/>
+        </w:rPr>
+      </w:pPr>
+      <w:r>
+        <w:rPr>
+          <w:highlight w:val="cyan"/>
+        </w:rPr>
+        <w:t xml:space="preserve"> </w:t>
+      </w:r>
+    </w:p>
+    <w:p>
+      <w:r>
+        <w:rPr>
+          <w:highlight w:val="cyan"/>
+        </w:rPr>
         <w:t>Exercício 031: Desenvolva um programa que pergunte a distância de uma viagem em Km. Calcule o preço da passagem, cobrando Ré0,45 parta viagens mais longas.</w:t>
       </w:r>
     </w:p>
@@ -695,27 +739,62 @@
       </w:r>
     </w:p>
     <w:p>
-      <w:r>
+      <w:pPr>
+        <w:rPr>
+          <w:highlight w:val="cyan"/>
+        </w:rPr>
+      </w:pPr>
+      <w:r>
+        <w:rPr>
+          <w:highlight w:val="cyan"/>
+        </w:rPr>
         <w:t>Exercício 032: Faça um programa que leia um ano qualquer e mostre se ele é bissexto.</w:t>
       </w:r>
     </w:p>
     <w:p>
-      <w:r>
-        <w:t xml:space="preserve"> </w:t>
-      </w:r>
-    </w:p>
-    <w:p>
-      <w:r>
+      <w:pPr>
+        <w:rPr>
+          <w:highlight w:val="cyan"/>
+        </w:rPr>
+      </w:pPr>
+      <w:r>
+        <w:rPr>
+          <w:highlight w:val="cyan"/>
+        </w:rPr>
+        <w:t xml:space="preserve"> </w:t>
+      </w:r>
+    </w:p>
+    <w:p>
+      <w:pPr>
+        <w:rPr>
+          <w:highlight w:val="cyan"/>
+        </w:rPr>
+      </w:pPr>
+      <w:r>
+        <w:rPr>
+          <w:highlight w:val="cyan"/>
+        </w:rPr>
         <w:t>Exercício 033: Faça um programa que leia três números e mostre qual é o maior e qual é o menor.</w:t>
       </w:r>
     </w:p>
     <w:p>
-      <w:r>
-        <w:t xml:space="preserve"> </w:t>
-      </w:r>
-    </w:p>
-    <w:p>
-      <w:r>
+      <w:pPr>
+        <w:rPr>
+          <w:highlight w:val="cyan"/>
+        </w:rPr>
+      </w:pPr>
+      <w:r>
+        <w:rPr>
+          <w:highlight w:val="cyan"/>
+        </w:rPr>
+        <w:t xml:space="preserve"> </w:t>
+      </w:r>
+    </w:p>
+    <w:p>
+      <w:r>
+        <w:rPr>
+          <w:highlight w:val="cyan"/>
+        </w:rPr>
         <w:t>Exercício 034: Escreva um programa que pergunte o salário de um funcionário e calcule o valor do seu aumento. Para salários superiores a R$1250,00, calcule um aumento de 10%. Para os inferiores ou iguais, o aumento é de 15%.</w:t>
       </w:r>
     </w:p>
@@ -726,6 +805,9 @@
     </w:p>
     <w:p>
       <w:r>
+        <w:rPr>
+          <w:highlight w:val="cyan"/>
+        </w:rPr>
         <w:t>Exercício 035: Desenvolva um programa que leia o comprimento de três retas e diga ao usuário se elas podem ou não formar um triângulo.</w:t>
       </w:r>
     </w:p>

</xml_diff>